<commit_message>
docs(envio_relatorio): atualiza documento de regras com nova logica de aceites
- Inclui regra de uso da revenda da base de aceites no calculo de Aceitaram
- Atualiza regra de base minima removida dos destaques
- Mantem regra de base ativa vinda do cadastro consolidado

Co-Authored-By: Claude Opus 4.8 (1M context) <noreply@anthropic.com>
</commit_message>
<xml_diff>
--- a/envio_relatorio/Regras_de_Negocio_envio_relatorio_Validacao.docx
+++ b/envio_relatorio/Regras_de_Negocio_envio_relatorio_Validacao.docx
@@ -820,24 +820,24 @@
     </w:p>
     <w:p>
       <w:pPr>
-        <w:pStyle w:val="Heading1"/>
-      </w:pPr>
-      <w:r>
-        <w:t>10. Cálculo de Aceites</w:t>
-      </w:r>
-    </w:p>
-    <w:p>
-      <w:pPr>
         <w:pStyle w:val="ListBullet"/>
       </w:pPr>
       <w:r>
         <w:rPr>
           <w:b/>
         </w:rPr>
-        <w:t>Base</w:t>
+        <w:t>Revenda usada</w:t>
       </w:r>
       <w:r>
-        <w:t>: Apenas CPFs Ativos (9.441).</w:t>
+        <w:t>: Revenda do cadastro consolidado.</w:t>
+      </w:r>
+    </w:p>
+    <w:p>
+      <w:pPr>
+        <w:pStyle w:val="Heading1"/>
+      </w:pPr>
+      <w:r>
+        <w:t>10. Cálculo de Aceites</w:t>
       </w:r>
     </w:p>
     <w:p>
@@ -862,10 +862,38 @@
         <w:rPr>
           <w:b/>
         </w:rPr>
-        <w:t>Contagem</w:t>
+        <w:t>Base Ativa</w:t>
       </w:r>
       <w:r>
-        <w:t>: Ativos que aparecem na base de aceites com DataAceite válida.</w:t>
+        <w:t>: CPFs Ativos agrupados pela revenda do cadastro consolidado.</w:t>
+      </w:r>
+    </w:p>
+    <w:p>
+      <w:pPr>
+        <w:pStyle w:val="ListBullet"/>
+      </w:pPr>
+      <w:r>
+        <w:rPr>
+          <w:b/>
+        </w:rPr>
+        <w:t>Aceitaram</w:t>
+      </w:r>
+      <w:r>
+        <w:t>: CPFs Ativos que fizeram aceite, agrupados pela revenda informada na PRÓPRIA base de aceites (coluna Revenda).</w:t>
+      </w:r>
+    </w:p>
+    <w:p>
+      <w:pPr>
+        <w:pStyle w:val="ListBullet"/>
+      </w:pPr>
+      <w:r>
+        <w:rPr>
+          <w:b/>
+        </w:rPr>
+        <w:t>Não Aceitaram</w:t>
+      </w:r>
+      <w:r>
+        <w:t>: Base Ativa − Aceitaram (não pode ser negativo).</w:t>
       </w:r>
     </w:p>
     <w:p>
@@ -879,7 +907,21 @@
         <w:t>Fórmula</w:t>
       </w:r>
       <w:r>
-        <w:t>: % = ativos que aceitaram ÷ base ativa.</w:t>
+        <w:t>: % = Aceitaram ÷ Base Ativa.</w:t>
+      </w:r>
+    </w:p>
+    <w:p>
+      <w:pPr>
+        <w:pStyle w:val="ListBullet"/>
+      </w:pPr>
+      <w:r>
+        <w:rPr>
+          <w:b/>
+        </w:rPr>
+        <w:t>Impacto</w:t>
+      </w:r>
+      <w:r>
+        <w:t>: Se um CPF é ativo em uma revenda no cadastro, mas fez aceite em outra revenda na base de aceites, ele conta como Aceitaram na revenda da base de aceites e como Não Aceitaram na revenda do cadastro.</w:t>
       </w:r>
     </w:p>
     <w:p>
@@ -888,16 +930,6 @@
       </w:pPr>
       <w:r>
         <w:t>11. Regras de destaque (Ranking / Parabéns)</w:t>
-      </w:r>
-    </w:p>
-    <w:p>
-      <w:r>
-        <w:t>A função identificar_destaque() seleciona a melhor revenda para o destaque Parabéns.</w:t>
-      </w:r>
-    </w:p>
-    <w:p>
-      <w:r>
-        <w:t>Regras:</w:t>
       </w:r>
     </w:p>
     <w:p>
@@ -930,7 +962,7 @@
         <w:t>Base mínima</w:t>
       </w:r>
       <w:r>
-        <w:t>: REMOVIDA. Anteriormente exigia base &gt;= 20 para destaque geral e &gt;= 10 para destaque regional. Agora qualquer base pode ser destacada.</w:t>
+        <w:t>: REMOVIDA. Qualquer revenda, independente do tamanho da base, pode ser destacada.</w:t>
       </w:r>
     </w:p>
     <w:p>
@@ -945,20 +977,6 @@
       </w:r>
       <w:r>
         <w:t>: Cadastros, Treinamentos e Aceites (tanto no geral quanto por regional).</w:t>
-      </w:r>
-    </w:p>
-    <w:p>
-      <w:pPr>
-        <w:pStyle w:val="ListBullet"/>
-      </w:pPr>
-      <w:r>
-        <w:rPr>
-          <w:b/>
-        </w:rPr>
-        <w:t>Exemplo atual</w:t>
-      </w:r>
-      <w:r>
-        <w:t>: Gazin Online (base 3, 100% aceite) agora pode ser destacada.</w:t>
       </w:r>
     </w:p>
     <w:p>
@@ -1157,6 +1175,14 @@
         <w:pStyle w:val="ListBullet"/>
       </w:pPr>
       <w:r>
+        <w:t>8bcec49 — usa revenda da base de aceites no cálculo de aceites</w:t>
+      </w:r>
+    </w:p>
+    <w:p>
+      <w:pPr>
+        <w:pStyle w:val="ListBullet"/>
+      </w:pPr>
+      <w:r>
         <w:t>2e3283c — remove regra de base mínima dos destaques</w:t>
       </w:r>
     </w:p>
@@ -1166,6 +1192,14 @@
       </w:pPr>
       <w:r>
         <w:t>267ebf6 — adiciona coluna Regional na base consolidada</w:t>
+      </w:r>
+    </w:p>
+    <w:p>
+      <w:pPr>
+        <w:pStyle w:val="ListBullet"/>
+      </w:pPr>
+      <w:r>
+        <w:t>e640c9a — adiciona documento de regras de negócio para validação</w:t>
       </w:r>
     </w:p>
     <w:p>

</xml_diff>